<commit_message>
Submit to Opt. Express
Corresponding author: surawutw@g.swu.ac.th
</commit_message>
<xml_diff>
--- a/paper/Cover letter.docx
+++ b/paper/Cover letter.docx
@@ -18,30 +18,59 @@
     <w:p>
       <w:pPr>
         <w:pStyle w:val="10BodySubsequentParagraph"/>
+        <w:rPr>
+          <w:color w:val="auto"/>
+        </w:rPr>
       </w:pPr>
       <w:r>
+        <w:rPr>
+          <w:color w:val="auto"/>
+        </w:rPr>
         <w:t>We wish to submit an original research article titled “Design and simulation of a broadband tunable transmittance optical filter using Sb</w:t>
       </w:r>
       <w:r>
         <w:rPr>
+          <w:color w:val="auto"/>
           <w:vertAlign w:val="subscript"/>
         </w:rPr>
         <w:t>2</w:t>
       </w:r>
       <w:r>
+        <w:rPr>
+          <w:color w:val="auto"/>
+        </w:rPr>
         <w:t>Se</w:t>
       </w:r>
       <w:r>
         <w:rPr>
+          <w:color w:val="auto"/>
           <w:vertAlign w:val="subscript"/>
         </w:rPr>
         <w:t>3</w:t>
       </w:r>
       <w:r>
+        <w:rPr>
+          <w:color w:val="auto"/>
+        </w:rPr>
         <w:t xml:space="preserve"> phase change material”</w:t>
       </w:r>
       <w:r>
-        <w:t xml:space="preserve"> for consideration by Optics Express.</w:t>
+        <w:rPr>
+          <w:color w:val="auto"/>
+        </w:rPr>
+        <w:t xml:space="preserve"> for consideration </w:t>
+      </w:r>
+      <w:r>
+        <w:rPr>
+          <w:color w:val="auto"/>
+        </w:rPr>
+        <w:t>in</w:t>
+      </w:r>
+      <w:r>
+        <w:rPr>
+          <w:color w:val="auto"/>
+        </w:rPr>
+        <w:t xml:space="preserve"> Optics Express.</w:t>
       </w:r>
     </w:p>
     <w:p>
@@ -54,183 +83,65 @@
         <w:pStyle w:val="10BodySubsequentParagraph"/>
       </w:pPr>
       <w:r>
-        <w:t xml:space="preserve">In this paper, we </w:t>
+        <w:t xml:space="preserve">In this work, we use transfer-matrix-method simulations to demonstrate that </w:t>
       </w:r>
+      <w:proofErr w:type="spellStart"/>
       <w:r>
-        <w:t xml:space="preserve">use computer simulation to </w:t>
+        <w:t>Sb₂Se</w:t>
       </w:r>
+      <w:proofErr w:type="spellEnd"/>
       <w:r>
-        <w:t>demonstrate that Sb</w:t>
+        <w:t xml:space="preserve">₃, a non-volatile phase-change material, can control the infrared transmittance of an optical filter with minimal optical loss. Compared to more established phase-change materials such as GST and VO₂, </w:t>
       </w:r>
+      <w:proofErr w:type="spellStart"/>
       <w:r>
-        <w:rPr>
-          <w:vertAlign w:val="subscript"/>
-        </w:rPr>
-        <w:t>2</w:t>
+        <w:t>Sb₂Se</w:t>
       </w:r>
+      <w:proofErr w:type="spellEnd"/>
       <w:r>
-        <w:t>Se</w:t>
-      </w:r>
-      <w:r>
-        <w:rPr>
-          <w:vertAlign w:val="subscript"/>
-        </w:rPr>
-        <w:t>3</w:t>
-      </w:r>
-      <w:r>
-        <w:t>, a non-volatile phase change material, can be used to controls the infrared transmittance of an optical filter</w:t>
-      </w:r>
-      <w:r>
-        <w:t xml:space="preserve"> with minimal optical loss</w:t>
-      </w:r>
-      <w:r>
-        <w:t xml:space="preserve">. </w:t>
-      </w:r>
-      <w:r>
-        <w:t xml:space="preserve">This is significant because </w:t>
-      </w:r>
-      <w:r>
-        <w:t>very few researches on low-loss, Sb</w:t>
-      </w:r>
-      <w:r>
-        <w:rPr>
-          <w:vertAlign w:val="subscript"/>
-        </w:rPr>
-        <w:t>2</w:t>
-      </w:r>
-      <w:r>
-        <w:t>Se</w:t>
-      </w:r>
-      <w:r>
-        <w:rPr>
-          <w:vertAlign w:val="subscript"/>
-        </w:rPr>
-        <w:t>3</w:t>
-      </w:r>
-      <w:r>
-        <w:t>-based filter exist.</w:t>
+        <w:t>₃ offers a substantially smaller extinction coefficient and higher switching endurance, yet very little research has explored its use in low-loss, transmittance-tunable filter designs. This work addresses that gap.</w:t>
       </w:r>
     </w:p>
     <w:p>
       <w:pPr>
         <w:pStyle w:val="10BodySubsequentParagraph"/>
       </w:pPr>
+    </w:p>
+    <w:p>
+      <w:pPr>
+        <w:pStyle w:val="10BodySubsequentParagraph"/>
+      </w:pPr>
       <w:r>
-        <w:t>The design is</w:t>
+        <w:t xml:space="preserve">Our design is a long-pass edge-filter composed of 11 layers of </w:t>
       </w:r>
+      <w:proofErr w:type="spellStart"/>
       <w:r>
-        <w:t xml:space="preserve"> long-pass edge-filter</w:t>
+        <w:t>Sb₂Se</w:t>
       </w:r>
+      <w:proofErr w:type="spellEnd"/>
       <w:r>
-        <w:t xml:space="preserve"> made from 11 layer</w:t>
+        <w:t xml:space="preserve">₃ and </w:t>
       </w:r>
+      <w:proofErr w:type="spellStart"/>
       <w:r>
-        <w:t>s</w:t>
+        <w:t>MgF</w:t>
       </w:r>
+      <w:proofErr w:type="spellEnd"/>
       <w:r>
-        <w:t xml:space="preserve"> of Sb</w:t>
+        <w:t>₂, enabling transmittance modulation in gradual steps from 93.4% to 0% around a 1064 nm operating wavelength, with a ~200 nm FWHM high-contrast region. We present the reasoning behind selecting this edge-filter architecture over other common planar thin-film designs, show that a simple optimization routine can further improve broadband performance, and confirm through endurance simulations that the design retains high transmittance contrast after 1.5×10⁶ phase-switching cycles.</w:t>
       </w:r>
+    </w:p>
+    <w:p>
+      <w:pPr>
+        <w:pStyle w:val="10BodySubsequentParagraph"/>
+      </w:pPr>
+    </w:p>
+    <w:p>
+      <w:pPr>
+        <w:pStyle w:val="10BodySubsequentParagraph"/>
+      </w:pPr>
       <w:r>
-        <w:rPr>
-          <w:vertAlign w:val="subscript"/>
-        </w:rPr>
-        <w:t>2</w:t>
-      </w:r>
-      <w:r>
-        <w:t>Se</w:t>
-      </w:r>
-      <w:r>
-        <w:rPr>
-          <w:vertAlign w:val="subscript"/>
-        </w:rPr>
-        <w:t>3</w:t>
-      </w:r>
-      <w:r>
-        <w:t xml:space="preserve"> and MgF</w:t>
-      </w:r>
-      <w:r>
-        <w:rPr>
-          <w:vertAlign w:val="subscript"/>
-        </w:rPr>
-        <w:t>2</w:t>
-      </w:r>
-      <w:r>
-        <w:t xml:space="preserve">, which allows </w:t>
-      </w:r>
-      <w:r>
-        <w:t xml:space="preserve">its transmittance to be modulated </w:t>
-      </w:r>
-      <w:r>
-        <w:t xml:space="preserve">in a gradual steps </w:t>
-      </w:r>
-      <w:r>
-        <w:t xml:space="preserve">from </w:t>
-      </w:r>
-      <w:r>
-        <w:t>93% to 0%.</w:t>
-      </w:r>
-      <w:r>
-        <w:t xml:space="preserve"> This high transmittance contrast region is centered around the 1064 nm wavelength, with FWHM of ~200 nm.</w:t>
-      </w:r>
-      <w:r>
-        <w:t xml:space="preserve"> </w:t>
-      </w:r>
-      <w:r>
-        <w:t>We</w:t>
-      </w:r>
-      <w:r>
-        <w:t xml:space="preserve"> </w:t>
-      </w:r>
-      <w:r>
-        <w:t>provide the</w:t>
-      </w:r>
-      <w:r>
-        <w:t xml:space="preserve"> reasoning </w:t>
-      </w:r>
-      <w:r>
-        <w:t>for selecting edge-filter design and compared its optical performance to other common planar thin-film design.</w:t>
-      </w:r>
-      <w:r>
-        <w:t xml:space="preserve"> And also perform optical endurance simulations to confirm that Sb</w:t>
-      </w:r>
-      <w:r>
-        <w:rPr>
-          <w:vertAlign w:val="subscript"/>
-        </w:rPr>
-        <w:t>2</w:t>
-      </w:r>
-      <w:r>
-        <w:t>Se</w:t>
-      </w:r>
-      <w:r>
-        <w:rPr>
-          <w:vertAlign w:val="subscript"/>
-        </w:rPr>
-        <w:t>3</w:t>
-      </w:r>
-      <w:r>
-        <w:t xml:space="preserve">-based multilayer design still has high transmittance after </w:t>
-      </w:r>
-      <w:r>
-        <w:t>1.5</w:t>
-      </w:r>
-      <w:r>
-        <w:t>×</w:t>
-      </w:r>
-      <w:r>
-        <w:t>10</w:t>
-      </w:r>
-      <w:r>
-        <w:rPr>
-          <w:vertAlign w:val="superscript"/>
-        </w:rPr>
-        <w:t>6</w:t>
-      </w:r>
-      <w:r>
-        <w:t xml:space="preserve"> phase switching cycles</w:t>
-      </w:r>
-      <w:r>
-        <w:t>.</w:t>
+        <w:t>We believe this work is well suited to Optics Express given its focus on the design, simulation, and performance evaluation of practical optical devices.</w:t>
       </w:r>
     </w:p>
     <w:p>
@@ -2170,6 +2081,7 @@
   <w:style w:type="character" w:default="1" w:styleId="DefaultParagraphFont">
     <w:name w:val="Default Paragraph Font"/>
     <w:uiPriority w:val="1"/>
+    <w:semiHidden/>
     <w:unhideWhenUsed/>
   </w:style>
   <w:style w:type="table" w:default="1" w:styleId="TableNormal">

</xml_diff>